<commit_message>
Clean headings in Word export
Co-Authored-By: Claude Fable 5.1 <noreply@anthropic.com>
</commit_message>
<xml_diff>
--- a/docs/CODE_WALKTHROUGH.docx
+++ b/docs/CODE_WALKTHROUGH.docx
@@ -237,7 +237,7 @@
         <w:pStyle w:val="Heading2"/>
       </w:pPr>
       <w:r>
-        <w:t>3.1 Entry point — `backend/app/main.py`</w:t>
+        <w:t>3.1 Entry point — backend/app/main.py</w:t>
       </w:r>
     </w:p>
     <w:p>
@@ -463,7 +463,7 @@
         <w:pStyle w:val="Heading2"/>
       </w:pPr>
       <w:r>
-        <w:t>3.2 Configuration — `backend/app/core/config.py`</w:t>
+        <w:t>3.2 Configuration — backend/app/core/config.py</w:t>
       </w:r>
     </w:p>
     <w:p>
@@ -811,7 +811,7 @@
         <w:pStyle w:val="Heading2"/>
       </w:pPr>
       <w:r>
-        <w:t>3.3 Database — `backend/app/core/database.py`</w:t>
+        <w:t>3.3 Database — backend/app/core/database.py</w:t>
       </w:r>
     </w:p>
     <w:p>
@@ -887,7 +887,7 @@
         <w:pStyle w:val="Heading2"/>
       </w:pPr>
       <w:r>
-        <w:t>3.4 Security — `backend/app/core/security.py`</w:t>
+        <w:t>3.4 Security — backend/app/core/security.py</w:t>
       </w:r>
     </w:p>
     <w:p>
@@ -1053,7 +1053,7 @@
         <w:pStyle w:val="Heading2"/>
       </w:pPr>
       <w:r>
-        <w:t>3.5 Data model — `backend/app/models/`</w:t>
+        <w:t>3.5 Data model — backend/app/models/</w:t>
       </w:r>
     </w:p>
     <w:tbl>
@@ -1779,7 +1779,7 @@
         <w:pStyle w:val="Heading2"/>
       </w:pPr>
       <w:r>
-        <w:t>3.6 Schemas — `backend/app/schemas/`</w:t>
+        <w:t>3.6 Schemas — backend/app/schemas/</w:t>
       </w:r>
     </w:p>
     <w:p>
@@ -2075,7 +2075,7 @@
         <w:pStyle w:val="Heading2"/>
       </w:pPr>
       <w:r>
-        <w:t>3.7 The engine — `backend/app/services/engine.py`</w:t>
+        <w:t>3.7 The engine — backend/app/services/engine.py</w:t>
       </w:r>
     </w:p>
     <w:p>
@@ -2571,7 +2571,7 @@
         <w:pStyle w:val="Heading2"/>
       </w:pPr>
       <w:r>
-        <w:t>3.8 Routers — `backend/app/api/`</w:t>
+        <w:t>3.8 Routers — backend/app/api/</w:t>
       </w:r>
     </w:p>
     <w:tbl>
@@ -3255,7 +3255,7 @@
         <w:pStyle w:val="Heading2"/>
       </w:pPr>
       <w:r>
-        <w:t>3.9 Demo data — `backend/app/db/seed.py`</w:t>
+        <w:t>3.9 Demo data — backend/app/db/seed.py</w:t>
       </w:r>
     </w:p>
     <w:p>
@@ -3288,7 +3288,7 @@
         <w:pStyle w:val="Heading2"/>
       </w:pPr>
       <w:r>
-        <w:t>3.10 Tests — `backend/tests/`</w:t>
+        <w:t>3.10 Tests — backend/tests/</w:t>
       </w:r>
     </w:p>
     <w:p>
@@ -3547,7 +3547,7 @@
         <w:pStyle w:val="Heading2"/>
       </w:pPr>
       <w:r>
-        <w:t>4.1 Entry and routing — `src/main.tsx`, `src/App.tsx`</w:t>
+        <w:t>4.1 Entry and routing — src/main.tsx, src/App.tsx</w:t>
       </w:r>
     </w:p>
     <w:p>
@@ -3755,7 +3755,7 @@
         <w:pStyle w:val="Heading2"/>
       </w:pPr>
       <w:r>
-        <w:t>4.2 Auth — `src/context/AuthContext.tsx`, `src/components/layout/RequireAuth.tsx`</w:t>
+        <w:t>4.2 Auth — src/context/AuthContext.tsx, src/components/layout/RequireAuth.tsx</w:t>
       </w:r>
     </w:p>
     <w:p>
@@ -3894,7 +3894,7 @@
         <w:pStyle w:val="Heading2"/>
       </w:pPr>
       <w:r>
-        <w:t>4.3 API client — `src/services/api.ts`</w:t>
+        <w:t>4.3 API client — src/services/api.ts</w:t>
       </w:r>
     </w:p>
     <w:p>
@@ -4051,7 +4051,7 @@
         <w:pStyle w:val="Heading2"/>
       </w:pPr>
       <w:r>
-        <w:t>4.5 Design system — `src/components/ui/`</w:t>
+        <w:t>4.5 Design system — src/components/ui/</w:t>
       </w:r>
     </w:p>
     <w:tbl>
@@ -4594,7 +4594,7 @@
         <w:pStyle w:val="Heading2"/>
       </w:pPr>
       <w:r>
-        <w:t>4.6 Application shell — `src/components/layout/`</w:t>
+        <w:t>4.6 Application shell — src/components/layout/</w:t>
       </w:r>
     </w:p>
     <w:p>
@@ -4701,7 +4701,7 @@
         <w:pStyle w:val="Heading2"/>
       </w:pPr>
       <w:r>
-        <w:t>4.7 Pages — `src/pages/`</w:t>
+        <w:t>4.7 Pages — src/pages/</w:t>
       </w:r>
     </w:p>
     <w:tbl>
@@ -5463,7 +5463,7 @@
         <w:pStyle w:val="Heading2"/>
       </w:pPr>
       <w:r>
-        <w:t>4.8 War Room components — `src/components/warroom/`</w:t>
+        <w:t>4.8 War Room components — src/components/warroom/</w:t>
       </w:r>
     </w:p>
     <w:p>
@@ -5557,7 +5557,7 @@
         <w:pStyle w:val="Heading2"/>
       </w:pPr>
       <w:r>
-        <w:t>4.9 Dashboard components — `src/components/dashboard/`</w:t>
+        <w:t>4.9 Dashboard components — src/components/dashboard/</w:t>
       </w:r>
     </w:p>
     <w:p>
@@ -5589,7 +5589,7 @@
         <w:pStyle w:val="Heading2"/>
       </w:pPr>
       <w:r>
-        <w:t>4.10 Forms — `src/components/forms/`</w:t>
+        <w:t>4.10 Forms — src/components/forms/</w:t>
       </w:r>
     </w:p>
     <w:p>

</xml_diff>